<commit_message>
Guia de Estudo: mostra os passos da apresentação em 2 minutos (faltavam no documento)
Co-Authored-By: Claude Opus 5.5 <noreply@anthropic.com>
Claude-Session: https://claude.ai/code/session_01527Jri6dhBVLGBbTPk8Mhm
</commit_message>
<xml_diff>
--- a/docs/entregas/Guia de Estudo - Chá.docx
+++ b/docs/entregas/Guia de Estudo - Chá.docx
@@ -1841,12 +1841,163 @@
       </w:r>
       <w:bookmarkEnd w:id="7"/>
     </w:p>
-    <rootKey>w:p</rootKey>
-    <rootKey>w:p</rootKey>
-    <rootKey>w:p</rootKey>
-    <rootKey>w:p</rootKey>
-    <rootKey>w:p</rootKey>
-    <rootKey>w:p</rootKey>
+    <w:p>
+      <w:pPr>
+        <w:pStyle w:val="ListParagraph"/>
+        <w:numPr>
+          <w:ilvl w:val="0"/>
+          <w:numId w:val="3"/>
+        </w:numPr>
+        <w:spacing w:after="80" w:line="288"/>
+      </w:pPr>
+      <w:r>
+        <w:rPr>
+          <w:rFonts w:ascii="Calibri" w:cs="Calibri" w:eastAsia="Calibri" w:hAnsi="Calibri"/>
+          <w:b/>
+          <w:bCs/>
+        </w:rPr>
+        <w:t xml:space="preserve">O problema:</w:t>
+      </w:r>
+      <w:r>
+        <w:rPr>
+          <w:rFonts w:ascii="Calibri" w:cs="Calibri" w:eastAsia="Calibri" w:hAnsi="Calibri"/>
+        </w:rPr>
+        <w:t xml:space="preserve"> quem trabalha ou estuda tem pouco tempo, e os cursos de mandarim em português de Portugal são poucos. A maioria está em inglês ou em português do Brasil.</w:t>
+      </w:r>
+    </w:p>
+    <w:p>
+      <w:pPr>
+        <w:pStyle w:val="ListParagraph"/>
+        <w:numPr>
+          <w:ilvl w:val="0"/>
+          <w:numId w:val="3"/>
+        </w:numPr>
+        <w:spacing w:after="80" w:line="288"/>
+      </w:pPr>
+      <w:r>
+        <w:rPr>
+          <w:rFonts w:ascii="Calibri" w:cs="Calibri" w:eastAsia="Calibri" w:hAnsi="Calibri"/>
+          <w:b/>
+          <w:bCs/>
+        </w:rPr>
+        <w:t xml:space="preserve">A ideia:</w:t>
+      </w:r>
+      <w:r>
+        <w:rPr>
+          <w:rFonts w:ascii="Calibri" w:cs="Calibri" w:eastAsia="Calibri" w:hAnsi="Calibri"/>
+        </w:rPr>
+        <w:t xml:space="preserve"> aprender um pouco todos os dias, no tempo de um chá. O nome também liga as duas línguas: a palavra portuguesa «chá» vem do chinês 茶 (chá), trazida de Macau no século XVI.</w:t>
+      </w:r>
+    </w:p>
+    <w:p>
+      <w:pPr>
+        <w:pStyle w:val="ListParagraph"/>
+        <w:numPr>
+          <w:ilvl w:val="0"/>
+          <w:numId w:val="3"/>
+        </w:numPr>
+        <w:spacing w:after="80" w:line="288"/>
+      </w:pPr>
+      <w:r>
+        <w:rPr>
+          <w:rFonts w:ascii="Calibri" w:cs="Calibri" w:eastAsia="Calibri" w:hAnsi="Calibri"/>
+          <w:b/>
+          <w:bCs/>
+        </w:rPr>
+        <w:t xml:space="preserve">O que o site tem:</w:t>
+      </w:r>
+      <w:r>
+        <w:rPr>
+          <w:rFonts w:ascii="Calibri" w:cs="Calibri" w:eastAsia="Calibri" w:hAnsi="Calibri"/>
+        </w:rPr>
+        <w:t xml:space="preserve"> uma rota de 6 cidades (Pequim, Xi'an, Chengdu, Guilin, Hangzhou e Xangai), com 24 unidades e 72 lições; páginas de sons, gramática, vocabulário, caracteres e cultura; 10 ferramentas de prática e uma biblioteca de recursos gratuitos.</w:t>
+      </w:r>
+    </w:p>
+    <w:p>
+      <w:pPr>
+        <w:pStyle w:val="ListParagraph"/>
+        <w:numPr>
+          <w:ilvl w:val="0"/>
+          <w:numId w:val="3"/>
+        </w:numPr>
+        <w:spacing w:after="80" w:line="288"/>
+      </w:pPr>
+      <w:r>
+        <w:rPr>
+          <w:rFonts w:ascii="Calibri" w:cs="Calibri" w:eastAsia="Calibri" w:hAnsi="Calibri"/>
+          <w:b/>
+          <w:bCs/>
+        </w:rPr>
+        <w:t xml:space="preserve">Como funciona por dentro:</w:t>
+      </w:r>
+      <w:r>
+        <w:rPr>
+          <w:rFonts w:ascii="Calibri" w:cs="Calibri" w:eastAsia="Calibri" w:hAnsi="Calibri"/>
+        </w:rPr>
+        <w:t xml:space="preserve"> o PHP vai buscar a rota, as lições e as palavras a uma base de dados MySQL com 9 tabelas. O JavaScript faz os exercícios e usa a voz do próprio browser para ler o chinês. Quem cria conta guarda as lições concluídas.</w:t>
+      </w:r>
+    </w:p>
+    <w:p>
+      <w:pPr>
+        <w:pStyle w:val="ListParagraph"/>
+        <w:numPr>
+          <w:ilvl w:val="0"/>
+          <w:numId w:val="3"/>
+        </w:numPr>
+        <w:spacing w:after="80" w:line="288"/>
+      </w:pPr>
+      <w:r>
+        <w:rPr>
+          <w:rFonts w:ascii="Calibri" w:cs="Calibri" w:eastAsia="Calibri" w:hAnsi="Calibri"/>
+          <w:b/>
+          <w:bCs/>
+        </w:rPr>
+        <w:t xml:space="preserve">Cuidados:</w:t>
+      </w:r>
+      <w:r>
+        <w:rPr>
+          <w:rFonts w:ascii="Calibri" w:cs="Calibri" w:eastAsia="Calibri" w:hAnsi="Calibri"/>
+        </w:rPr>
+        <w:t xml:space="preserve"> segurança (palavras-passe com hash, proteção contra SQL injection, XSS e CSRF, limite de tentativas de login), RGPD (consentimento, idade mínima de 13 anos, direito a apagar a conta) e acessibilidade (contraste, teclado, leitores de ecrã).</w:t>
+      </w:r>
+    </w:p>
+    <w:p>
+      <w:pPr>
+        <w:pStyle w:val="ListParagraph"/>
+        <w:numPr>
+          <w:ilvl w:val="0"/>
+          <w:numId w:val="3"/>
+        </w:numPr>
+        <w:spacing w:after="80" w:line="288"/>
+      </w:pPr>
+      <w:r>
+        <w:rPr>
+          <w:rFonts w:ascii="Calibri" w:cs="Calibri" w:eastAsia="Calibri" w:hAnsi="Calibri"/>
+          <w:b/>
+          <w:bCs/>
+        </w:rPr>
+        <w:t xml:space="preserve">O que aprendi:</w:t>
+      </w:r>
+      <w:r>
+        <w:rPr>
+          <w:rFonts w:ascii="Calibri" w:cs="Calibri" w:eastAsia="Calibri" w:hAnsi="Calibri"/>
+        </w:rPr>
+        <w:t xml:space="preserve"> </w:t>
+      </w:r>
+      <w:r>
+        <w:rPr>
+          <w:rFonts w:ascii="Calibri" w:cs="Calibri" w:eastAsia="Calibri" w:hAnsi="Calibri"/>
+          <w:highlight w:val="yellow"/>
+        </w:rPr>
+        <w:t xml:space="preserve">[uma ou duas frases tuas, por exemplo: organizar um projeto grande, a importância de testar com pessoas reais]</w:t>
+      </w:r>
+      <w:r>
+        <w:rPr>
+          <w:rFonts w:ascii="Calibri" w:cs="Calibri" w:eastAsia="Calibri" w:hAnsi="Calibri"/>
+        </w:rPr>
+        <w:t xml:space="preserve">.</w:t>
+      </w:r>
+    </w:p>
     <w:p>
       <w:pPr>
         <w:pStyle w:val="Heading2"/>
@@ -8350,6 +8501,12 @@
   </w:num>
   <w:num w:numId="2">
     <w:abstractNumId w:val="2"/>
+    <w:lvlOverride w:ilvl="0">
+      <w:startOverride w:val="1"/>
+    </w:lvlOverride>
+  </w:num>
+  <w:num w:numId="3">
+    <w:abstractNumId w:val="3"/>
     <w:lvlOverride w:ilvl="0">
       <w:startOverride w:val="1"/>
     </w:lvlOverride>

</xml_diff>